<commit_message>
Apply FleetOps AMR-001 UOM mismatch amendment
</commit_message>
<xml_diff>
--- a/docs/architecture/FleetOps_Architecture_Boundary_v0.1.docx
+++ b/docs/architecture/FleetOps_Architecture_Boundary_v0.1.docx
@@ -1270,7 +1270,15 @@
         <w:t>Where they disagree, the disagreement becomes a first-class exception record. The v0.1 exception types are: short, over, substitution, damaged, opened, unreadable identif</w:t>
       </w:r>
       <w:r>
-        <w:t>ier, serial mismatch, unexpected item, quantity variance. Missing lot is added with the materials layer.</w:t>
+        <w:t>ier, serial mismatch, unexpected item, quantity variance, UOM mismatch. Missing lot is added with the materials layer.</w:t>
+      </w:r>
+    </w:p>
+    <w:p>
+      <w:pPr>
+        <w:spacing w:after="140"/>
+      </w:pPr>
+      <w:r>
+        <w:t>UOM mismatch records that the actual receipt UOM differs from the immutable expected purchase order line UOM and FleetOps has no governed conversion authority for comparing the quantities. It signals incomparability only. It does not establish equality, short, over, substitution, quantity variance, or successful or failed conversion, and does not authorize unit conversion.</w:t>
       </w:r>
     </w:p>
     <w:p>
@@ -4343,6 +4351,19 @@
       </w:r>
       <w:r>
         <w:t>cost attribution; Section 10 excludes request records and governed operations explicitly; Section 8 scope text aligned; appendices added. Frozen.</w:t>
+      </w:r>
+    </w:p>
+    <w:p>
+      <w:pPr>
+        <w:pStyle w:val="ListParagraph"/>
+        <w:numPr>
+          <w:ilvl w:val="0"/>
+          <w:numId w:val="2"/>
+        </w:numPr>
+        <w:spacing w:after="60"/>
+      </w:pPr>
+      <w:r>
+        <w:t>11 Sep 2026 — AMR-001 applied: added UOM mismatch to D5 so receiving can preserve differing expected/actual UOM without unauthorized conversion; existing exception meanings and the Section 9 acceptance scenario remain unchanged.</w:t>
       </w:r>
     </w:p>
     <w:p>

</xml_diff>